<commit_message>
Switch recommendation to Onion PS based on portal entry counts
Co-Authored-By: Claude Opus 5.5 <noreply@anthropic.com>
Claude-Session: https://claude.ai/code/session_01FoKKWywX13eJqNmgmybGBM
</commit_message>
<xml_diff>
--- a/SIH_PS_Selection_Guide.docx
+++ b/SIH_PS_Selection_Guide.docx
@@ -87,7 +87,7 @@
               <w:t xml:space="preserve">Select: </w:t>
             </w:r>
             <w:r>
-              <w:t xml:space="preserve">SIH 26045 – IP-SAKTI Sahayak (Ministry of Ayush)</w:t>
+              <w:t xml:space="preserve">SIH 26031 – Onion Quality Grading App (DoCA)</w:t>
             </w:r>
           </w:p>
           <w:p>
@@ -102,7 +102,7 @@
               <w:t xml:space="preserve">Backup: </w:t>
             </w:r>
             <w:r>
-              <w:t xml:space="preserve">SIH 26031 – Onion Quality Grading App (DoCA)</w:t>
+              <w:t xml:space="preserve">SIH 26045 – IP-SAKTI Sahayak (Ministry of Ayush)</w:t>
             </w:r>
           </w:p>
           <w:p>
@@ -129,10 +129,10 @@
                 <w:b/>
                 <w:bCs/>
               </w:rPr>
-              <w:t xml:space="preserve">Before final submit: </w:t>
-            </w:r>
-            <w:r>
-              <w:t xml:space="preserve">check the number of ideas already submitted for each PS on the SIH portal. If 26045 is very crowded and Onion is not, switch to Onion.</w:t>
+              <w:t xml:space="preserve">Why: </w:t>
+            </w:r>
+            <w:r>
+              <w:t xml:space="preserve">SIH portal count (as of 26 Sep 2026) – Onion: 51 ideas, IP-SAKTI: 88 ideas. Both PSs are equally strong (8/10), so we pick the one with ~40% less competition.</w:t>
             </w:r>
           </w:p>
         </w:tc>
@@ -754,7 +754,7 @@
                 <w:sz w:val="19"/>
                 <w:szCs w:val="19"/>
               </w:rPr>
-              <w:t xml:space="preserve">26045 – IP-SAKTI</w:t>
+              <w:t xml:space="preserve">26031 – Onion Grading</w:t>
             </w:r>
           </w:p>
         </w:tc>
@@ -799,7 +799,7 @@
                 <w:sz w:val="19"/>
                 <w:szCs w:val="19"/>
               </w:rPr>
-              <w:t xml:space="preserve">Clear requirements, less crowded, easy to build fast, we already have a detailed plan</w:t>
+              <w:t xml:space="preserve">Very clear real-world problem, easy to explain, fewer entries (51)</w:t>
             </w:r>
           </w:p>
         </w:tc>
@@ -824,7 +824,7 @@
                 <w:sz w:val="19"/>
                 <w:szCs w:val="19"/>
               </w:rPr>
-              <w:t xml:space="preserve">26031 – Onion Grading</w:t>
+              <w:t xml:space="preserve">26045 – IP-SAKTI</w:t>
             </w:r>
           </w:p>
         </w:tc>
@@ -869,7 +869,7 @@
                 <w:sz w:val="19"/>
                 <w:szCs w:val="19"/>
               </w:rPr>
-              <w:t xml:space="preserve">Very clear real-world problem, easy to explain, but many teams will pick it</w:t>
+              <w:t xml:space="preserve">Clear requirements and detailed plan, but more entries (88) and needs IP-law knowledge</w:t>
             </w:r>
           </w:p>
         </w:tc>
@@ -1416,7 +1416,30 @@
                 <w:sz w:val="19"/>
                 <w:szCs w:val="19"/>
               </w:rPr>
-              <w:t xml:space="preserve">Expected competition</w:t>
+              <w:t xml:space="preserve">Entries on portal (26 Sep)</w:t>
+            </w:r>
+          </w:p>
+        </w:tc>
+        <w:tc>
+          <w:tcPr>
+            <w:tcW w:type="dxa" w:w="1700"/>
+            <w:shd w:fill="E2EFDA" w:color="auto" w:val="clear"/>
+            <w:tcMar>
+              <w:top w:type="dxa" w:w="60"/>
+              <w:left w:type="dxa" w:w="100"/>
+              <w:bottom w:type="dxa" w:w="60"/>
+              <w:right w:type="dxa" w:w="100"/>
+            </w:tcMar>
+          </w:tcPr>
+          <w:p>
+            <w:r>
+              <w:rPr>
+                <w:b w:val="false"/>
+                <w:bCs w:val="false"/>
+                <w:sz w:val="19"/>
+                <w:szCs w:val="19"/>
+              </w:rPr>
+              <w:t xml:space="preserve">51 (lowest)</w:t>
             </w:r>
           </w:p>
         </w:tc>
@@ -1439,30 +1462,7 @@
                 <w:sz w:val="19"/>
                 <w:szCs w:val="19"/>
               </w:rPr>
-              <w:t xml:space="preserve">High</w:t>
-            </w:r>
-          </w:p>
-        </w:tc>
-        <w:tc>
-          <w:tcPr>
-            <w:tcW w:type="dxa" w:w="1700"/>
-            <w:shd w:fill="E2EFDA" w:color="auto" w:val="clear"/>
-            <w:tcMar>
-              <w:top w:type="dxa" w:w="60"/>
-              <w:left w:type="dxa" w:w="100"/>
-              <w:bottom w:type="dxa" w:w="60"/>
-              <w:right w:type="dxa" w:w="100"/>
-            </w:tcMar>
-          </w:tcPr>
-          <w:p>
-            <w:r>
-              <w:rPr>
-                <w:b w:val="false"/>
-                <w:bCs w:val="false"/>
-                <w:sz w:val="19"/>
-                <w:szCs w:val="19"/>
-              </w:rPr>
-              <w:t xml:space="preserve">Medium–Low</w:t>
+              <w:t xml:space="preserve">88</w:t>
             </w:r>
           </w:p>
         </w:tc>
@@ -1485,30 +1485,29 @@
                 <w:sz w:val="19"/>
                 <w:szCs w:val="19"/>
               </w:rPr>
-              <w:t xml:space="preserve">Very high</w:t>
-            </w:r>
-          </w:p>
-        </w:tc>
-        <w:tc>
-          <w:tcPr>
-            <w:tcW w:type="dxa" w:w="1700"/>
-            <w:shd w:fill="FFF2CC" w:color="auto" w:val="clear"/>
-            <w:tcMar>
-              <w:top w:type="dxa" w:w="60"/>
-              <w:left w:type="dxa" w:w="100"/>
-              <w:bottom w:type="dxa" w:w="60"/>
-              <w:right w:type="dxa" w:w="100"/>
-            </w:tcMar>
-          </w:tcPr>
-          <w:p>
-            <w:r>
-              <w:rPr>
-                <w:b w:val="false"/>
-                <w:bCs w:val="false"/>
-                <w:sz w:val="19"/>
-                <w:szCs w:val="19"/>
-              </w:rPr>
-              <w:t xml:space="preserve">High</w:t>
+              <w:t xml:space="preserve">Not checked</w:t>
+            </w:r>
+          </w:p>
+        </w:tc>
+        <w:tc>
+          <w:tcPr>
+            <w:tcW w:type="dxa" w:w="1700"/>
+            <w:tcMar>
+              <w:top w:type="dxa" w:w="60"/>
+              <w:left w:type="dxa" w:w="100"/>
+              <w:bottom w:type="dxa" w:w="60"/>
+              <w:right w:type="dxa" w:w="100"/>
+            </w:tcMar>
+          </w:tcPr>
+          <w:p>
+            <w:r>
+              <w:rPr>
+                <w:b w:val="false"/>
+                <w:bCs w:val="false"/>
+                <w:sz w:val="19"/>
+                <w:szCs w:val="19"/>
+              </w:rPr>
+              <w:t xml:space="preserve">Not checked</w:t>
             </w:r>
           </w:p>
         </w:tc>
@@ -1885,6 +1884,7 @@
         <w:tc>
           <w:tcPr>
             <w:tcW w:type="dxa" w:w="1700"/>
+            <w:shd w:fill="E2EFDA" w:color="auto" w:val="clear"/>
             <w:tcMar>
               <w:top w:type="dxa" w:w="60"/>
               <w:left w:type="dxa" w:w="100"/>
@@ -1907,6 +1907,7 @@
         <w:tc>
           <w:tcPr>
             <w:tcW w:type="dxa" w:w="1700"/>
+            <w:shd w:fill="FFF2CC" w:color="auto" w:val="clear"/>
             <w:tcMar>
               <w:top w:type="dxa" w:w="60"/>
               <w:left w:type="dxa" w:w="100"/>
@@ -2228,7 +2229,7 @@
         <w:spacing w:after="100" w:before="200"/>
       </w:pPr>
       <w:r>
-        <w:t xml:space="preserve">26045 – IP-SAKTI Sahayak  ✔ SELECTED</w:t>
+        <w:t xml:space="preserve">26045 – IP-SAKTI Sahayak  (BACKUP)</w:t>
       </w:r>
     </w:p>
     <w:p>
@@ -2245,10 +2246,10 @@
           <w:b/>
           <w:bCs/>
         </w:rPr>
-        <w:t xml:space="preserve">Good: </w:t>
-      </w:r>
-      <w:r>
-        <w:t xml:space="preserve">Ayush PSs usually get fewer teams than ISRO / agri ones.</w:t>
+        <w:t xml:space="preserve">Bad: </w:t>
+      </w:r>
+      <w:r>
+        <w:t xml:space="preserve">88 entries already – more competition than Onion.</w:t>
       </w:r>
     </w:p>
     <w:p>
@@ -2357,7 +2358,7 @@
         <w:spacing w:after="100" w:before="200"/>
       </w:pPr>
       <w:r>
-        <w:t xml:space="preserve">26031 – Onion Grading  (BACKUP)</w:t>
+        <w:t xml:space="preserve">26031 – Onion Grading  ✔ SELECTED</w:t>
       </w:r>
     </w:p>
     <w:p>
@@ -2414,10 +2415,10 @@
           <w:b/>
           <w:bCs/>
         </w:rPr>
-        <w:t xml:space="preserve">Bad: </w:t>
-      </w:r>
-      <w:r>
-        <w:t xml:space="preserve">Popular category (agri + AI camera) – many teams.</w:t>
+        <w:t xml:space="preserve">Good: </w:t>
+      </w:r>
+      <w:r>
+        <w:t xml:space="preserve">Only 51 entries – lowest competition among our options.</w:t>
       </w:r>
     </w:p>
     <w:p>
@@ -2434,19 +2435,10 @@
           <w:b/>
           <w:bCs/>
         </w:rPr>
-        <w:t xml:space="preserve">Bad: </w:t>
-      </w:r>
-      <w:r>
-        <w:t xml:space="preserve">Need to collect our own onion images (1–2k) for a real model.</w:t>
-      </w:r>
-    </w:p>
-    <w:p>
-      <w:pPr>
-        <w:pStyle w:val="Heading2"/>
-        <w:spacing w:after="100" w:before="200"/>
-      </w:pPr>
-      <w:r>
-        <w:t xml:space="preserve">26171 – ISRO Browser Agent  ✘ AVOID</w:t>
+        <w:t xml:space="preserve">Good: </w:t>
+      </w:r>
+      <w:r>
+        <w:t xml:space="preserve">No special domain knowledge needed – everyone in the team understands onions!</w:t>
       </w:r>
     </w:p>
     <w:p>
@@ -2463,10 +2455,19 @@
           <w:b/>
           <w:bCs/>
         </w:rPr>
-        <w:t xml:space="preserve">Good: </w:t>
-      </w:r>
-      <w:r>
-        <w:t xml:space="preserve">Hot topic (AI agents + privacy), ISRO name.</w:t>
+        <w:t xml:space="preserve">Bad: </w:t>
+      </w:r>
+      <w:r>
+        <w:t xml:space="preserve">Need to collect our own onion images (1–2k) for a real model.</w:t>
+      </w:r>
+    </w:p>
+    <w:p>
+      <w:pPr>
+        <w:pStyle w:val="Heading2"/>
+        <w:spacing w:after="100" w:before="200"/>
+      </w:pPr>
+      <w:r>
+        <w:t xml:space="preserve">26171 – ISRO Browser Agent  ✘ AVOID</w:t>
       </w:r>
     </w:p>
     <w:p>
@@ -2483,10 +2484,10 @@
           <w:b/>
           <w:bCs/>
         </w:rPr>
-        <w:t xml:space="preserve">Bad: </w:t>
-      </w:r>
-      <w:r>
-        <w:t xml:space="preserve">Most crowded, most technical; ISRO judges will ask deep questions.</w:t>
+        <w:t xml:space="preserve">Good: </w:t>
+      </w:r>
+      <w:r>
+        <w:t xml:space="preserve">Hot topic (AI agents + privacy), ISRO name.</w:t>
       </w:r>
     </w:p>
     <w:p>
@@ -2506,16 +2507,7 @@
         <w:t xml:space="preserve">Bad: </w:t>
       </w:r>
       <w:r>
-        <w:t xml:space="preserve">PPT alone won’t convince without a working proof.</w:t>
-      </w:r>
-    </w:p>
-    <w:p>
-      <w:pPr>
-        <w:pStyle w:val="Heading2"/>
-        <w:spacing w:after="100" w:before="200"/>
-      </w:pPr>
-      <w:r>
-        <w:t xml:space="preserve">26021 – Honey Chain  ✘ AVOID</w:t>
+        <w:t xml:space="preserve">Most crowded, most technical; ISRO judges will ask deep questions.</w:t>
       </w:r>
     </w:p>
     <w:p>
@@ -2532,10 +2524,19 @@
           <w:b/>
           <w:bCs/>
         </w:rPr>
-        <w:t xml:space="preserve">Good: </w:t>
-      </w:r>
-      <w:r>
-        <w:t xml:space="preserve">Nice visuals – QR scan, timeline, dashboards.</w:t>
+        <w:t xml:space="preserve">Bad: </w:t>
+      </w:r>
+      <w:r>
+        <w:t xml:space="preserve">PPT alone won’t convince without a working proof.</w:t>
+      </w:r>
+    </w:p>
+    <w:p>
+      <w:pPr>
+        <w:pStyle w:val="Heading2"/>
+        <w:spacing w:after="100" w:before="200"/>
+      </w:pPr>
+      <w:r>
+        <w:t xml:space="preserve">26021 – Honey Chain  ✘ AVOID</w:t>
       </w:r>
     </w:p>
     <w:p>
@@ -2552,10 +2553,10 @@
           <w:b/>
           <w:bCs/>
         </w:rPr>
-        <w:t xml:space="preserve">Bad: </w:t>
-      </w:r>
-      <w:r>
-        <w:t xml:space="preserve">“Blockchain + AI + IoT” is a buzzword combo many teams will pitch.</w:t>
+        <w:t xml:space="preserve">Good: </w:t>
+      </w:r>
+      <w:r>
+        <w:t xml:space="preserve">Nice visuals – QR scan, timeline, dashboards.</w:t>
       </w:r>
     </w:p>
     <w:p>
@@ -2575,39 +2576,7 @@
         <w:t xml:space="preserve">Bad: </w:t>
       </w:r>
       <w:r>
-        <w:t xml:space="preserve">AI disease prediction has no real data; IoT needs hardware.</w:t>
-      </w:r>
-    </w:p>
-    <w:p>
-      <w:pPr>
-        <w:pStyle w:val="Heading1"/>
-        <w:spacing w:after="150" w:before="300"/>
-      </w:pPr>
-      <w:r>
-        <w:t xml:space="preserve">5. Can We Get Selected Only With a PPT?</w:t>
-      </w:r>
-    </w:p>
-    <w:p>
-      <w:pPr>
-        <w:spacing w:after="120"/>
-      </w:pPr>
-      <w:r>
-        <w:rPr>
-          <w:b/>
-          <w:bCs/>
-        </w:rPr>
-        <w:t xml:space="preserve">Yes. </w:t>
-      </w:r>
-      <w:r>
-        <w:t xml:space="preserve">The first SIH round (idea submission) is judged mainly on the PPT in the official template. A prototype is not compulsory at this stage. (Check our college’s internal rules – some ask for a small demo.)</w:t>
-      </w:r>
-    </w:p>
-    <w:p>
-      <w:pPr>
-        <w:spacing w:after="120"/>
-      </w:pPr>
-      <w:r>
-        <w:t xml:space="preserve">But only a few teams are shortlisted per PS, so our PPT must stand out. It must include:</w:t>
+        <w:t xml:space="preserve">“Blockchain + AI + IoT” is a buzzword combo many teams will pitch.</w:t>
       </w:r>
     </w:p>
     <w:p>
@@ -2624,10 +2593,42 @@
           <w:b/>
           <w:bCs/>
         </w:rPr>
-        <w:t xml:space="preserve">UI mockups </w:t>
-      </w:r>
-      <w:r>
-        <w:t xml:space="preserve">(Figma screens) – judges must SEE the product.</w:t>
+        <w:t xml:space="preserve">Bad: </w:t>
+      </w:r>
+      <w:r>
+        <w:t xml:space="preserve">AI disease prediction has no real data; IoT needs hardware.</w:t>
+      </w:r>
+    </w:p>
+    <w:p>
+      <w:pPr>
+        <w:pStyle w:val="Heading1"/>
+        <w:spacing w:after="150" w:before="300"/>
+      </w:pPr>
+      <w:r>
+        <w:t xml:space="preserve">5. Can We Get Selected Only With a PPT?</w:t>
+      </w:r>
+    </w:p>
+    <w:p>
+      <w:pPr>
+        <w:spacing w:after="120"/>
+      </w:pPr>
+      <w:r>
+        <w:rPr>
+          <w:b/>
+          <w:bCs/>
+        </w:rPr>
+        <w:t xml:space="preserve">Yes. </w:t>
+      </w:r>
+      <w:r>
+        <w:t xml:space="preserve">The first SIH round (idea submission) is judged mainly on the PPT in the official template. A prototype is not compulsory at this stage. (Check our college’s internal rules – some ask for a small demo.)</w:t>
+      </w:r>
+    </w:p>
+    <w:p>
+      <w:pPr>
+        <w:spacing w:after="120"/>
+      </w:pPr>
+      <w:r>
+        <w:t xml:space="preserve">But only a few teams are shortlisted per PS, so our PPT must stand out. It must include:</w:t>
       </w:r>
     </w:p>
     <w:p>
@@ -2644,7 +2645,10 @@
           <w:b/>
           <w:bCs/>
         </w:rPr>
-        <w:t xml:space="preserve">Clear architecture / flow diagram.</w:t>
+        <w:t xml:space="preserve">UI mockups </w:t>
+      </w:r>
+      <w:r>
+        <w:t xml:space="preserve">(Figma screens) – judges must SEE the product.</w:t>
       </w:r>
     </w:p>
     <w:p>
@@ -2661,10 +2665,7 @@
           <w:b/>
           <w:bCs/>
         </w:rPr>
-        <w:t xml:space="preserve">Feasibility: </w:t>
-      </w:r>
-      <w:r>
-        <w:t xml:space="preserve">tech stack, why it works, limitations and how we handle them.</w:t>
+        <w:t xml:space="preserve">Clear architecture / flow diagram.</w:t>
       </w:r>
     </w:p>
     <w:p>
@@ -2681,10 +2682,10 @@
           <w:b/>
           <w:bCs/>
         </w:rPr>
-        <w:t xml:space="preserve">Impact: </w:t>
-      </w:r>
-      <w:r>
-        <w:t xml:space="preserve">who benefits and how.</w:t>
+        <w:t xml:space="preserve">Feasibility: </w:t>
+      </w:r>
+      <w:r>
+        <w:t xml:space="preserve">tech stack, why it works, limitations and how we handle them.</w:t>
       </w:r>
     </w:p>
     <w:p>
@@ -2701,10 +2702,10 @@
           <w:b/>
           <w:bCs/>
         </w:rPr>
-        <w:t xml:space="preserve">Unique features </w:t>
-      </w:r>
-      <w:r>
-        <w:t xml:space="preserve">that other teams won’t have.</w:t>
+        <w:t xml:space="preserve">Impact: </w:t>
+      </w:r>
+      <w:r>
+        <w:t xml:space="preserve">who benefits and how.</w:t>
       </w:r>
     </w:p>
     <w:p>
@@ -2721,6 +2722,26 @@
           <w:b/>
           <w:bCs/>
         </w:rPr>
+        <w:t xml:space="preserve">Unique features </w:t>
+      </w:r>
+      <w:r>
+        <w:t xml:space="preserve">that other teams won’t have.</w:t>
+      </w:r>
+    </w:p>
+    <w:p>
+      <w:pPr>
+        <w:pStyle w:val="ListParagraph"/>
+        <w:numPr>
+          <w:ilvl w:val="0"/>
+          <w:numId w:val="2"/>
+        </w:numPr>
+        <w:spacing w:after="60"/>
+      </w:pPr>
+      <w:r>
+        <w:rPr>
+          <w:b/>
+          <w:bCs/>
+        </w:rPr>
         <w:t xml:space="preserve">Optional but powerful: </w:t>
       </w:r>
       <w:r>
@@ -2733,7 +2754,7 @@
         <w:spacing w:after="150" w:before="300"/>
       </w:pPr>
       <w:r>
-        <w:t xml:space="preserve">6. Key Points to Put in the IP-SAKTI PPT</w:t>
+        <w:t xml:space="preserve">6. Key Points to Put in the Onion PPT</w:t>
       </w:r>
     </w:p>
     <w:tbl>
@@ -2825,7 +2846,7 @@
                 <w:sz w:val="19"/>
                 <w:szCs w:val="19"/>
               </w:rPr>
-              <w:t xml:space="preserve">Product Classifier (asks 3–4 questions first)</w:t>
+              <w:t xml:space="preserve">Guided photo capture (tray + size marker, flip photo)</w:t>
             </w:r>
           </w:p>
         </w:tc>
@@ -2847,7 +2868,7 @@
                 <w:sz w:val="19"/>
                 <w:szCs w:val="19"/>
               </w:rPr>
-              <w:t xml:space="preserve">PS wants classification-first approach</w:t>
+              <w:t xml:space="preserve">Honest, standard sampling – same method at every centre</w:t>
             </w:r>
           </w:p>
         </w:tc>
@@ -2872,7 +2893,7 @@
                 <w:sz w:val="19"/>
                 <w:szCs w:val="19"/>
               </w:rPr>
-              <w:t xml:space="preserve">Answers with official sources (Act, Section, link)</w:t>
+              <w:t xml:space="preserve">On-phone AI: finds rotten / sprouted / damaged / mould / small onions</w:t>
             </w:r>
           </w:p>
         </w:tc>
@@ -2894,7 +2915,7 @@
                 <w:sz w:val="19"/>
                 <w:szCs w:val="19"/>
               </w:rPr>
-              <w:t xml:space="preserve">No AI hallucination – trustworthy</w:t>
+              <w:t xml:space="preserve">Directly matches PS requirements</w:t>
             </w:r>
           </w:p>
         </w:tc>
@@ -2919,7 +2940,7 @@
                 <w:sz w:val="19"/>
                 <w:szCs w:val="19"/>
               </w:rPr>
-              <w:t xml:space="preserve">India 🇮🇳 / International 🌍 switch</w:t>
+              <w:t xml:space="preserve">Size in mm using a reference marker (coin / ArUco)</w:t>
             </w:r>
           </w:p>
         </w:tc>
@@ -2941,7 +2962,7 @@
                 <w:sz w:val="19"/>
                 <w:szCs w:val="19"/>
               </w:rPr>
-              <w:t xml:space="preserve">PS asks to keep both jurisdictions separate</w:t>
+              <w:t xml:space="preserve">Objective ‘undersized’ check, no guessing</w:t>
             </w:r>
           </w:p>
         </w:tc>
@@ -2966,7 +2987,7 @@
                 <w:sz w:val="19"/>
                 <w:szCs w:val="19"/>
               </w:rPr>
-              <w:t xml:space="preserve">ABS + TKDL checker</w:t>
+              <w:t xml:space="preserve">Grade A / URS / Reject % + final lot grade</w:t>
             </w:r>
           </w:p>
         </w:tc>
@@ -2988,7 +3009,7 @@
                 <w:sz w:val="19"/>
                 <w:szCs w:val="19"/>
               </w:rPr>
-              <w:t xml:space="preserve">Makes us different from a normal ChatGPT</w:t>
+              <w:t xml:space="preserve">Exactly what the PS asks for</w:t>
             </w:r>
           </w:p>
         </w:tc>
@@ -3013,7 +3034,7 @@
                 <w:sz w:val="19"/>
                 <w:szCs w:val="19"/>
               </w:rPr>
-              <w:t xml:space="preserve">“Why am I told this?” evidence panel</w:t>
+              <w:t xml:space="preserve">Configurable grading rules (thresholds in a settings file)</w:t>
             </w:r>
           </w:p>
         </w:tc>
@@ -3035,7 +3056,7 @@
                 <w:sz w:val="19"/>
                 <w:szCs w:val="19"/>
               </w:rPr>
-              <w:t xml:space="preserve">Makes AI answers auditable</w:t>
+              <w:t xml:space="preserve">Ministry can change specs without new code</w:t>
             </w:r>
           </w:p>
         </w:tc>
@@ -3060,7 +3081,7 @@
                 <w:sz w:val="19"/>
                 <w:szCs w:val="19"/>
               </w:rPr>
-              <w:t xml:space="preserve">IP Protection Roadmap (step-by-step)</w:t>
+              <w:t xml:space="preserve">Instant PDF report with photos, GPS, time, QR + tamper-proof hash</w:t>
             </w:r>
           </w:p>
         </w:tc>
@@ -3082,7 +3103,7 @@
                 <w:sz w:val="19"/>
                 <w:szCs w:val="19"/>
               </w:rPr>
-              <w:t xml:space="preserve">Gives action plan, not just a chat reply</w:t>
+              <w:t xml:space="preserve">Transparency – no one can edit the result</w:t>
             </w:r>
           </w:p>
         </w:tc>
@@ -3107,7 +3128,7 @@
                 <w:sz w:val="19"/>
                 <w:szCs w:val="19"/>
               </w:rPr>
-              <w:t xml:space="preserve">Abstain + escalate to human expert</w:t>
+              <w:t xml:space="preserve">Works offline, syncs later</w:t>
             </w:r>
           </w:p>
         </w:tc>
@@ -3129,7 +3150,7 @@
                 <w:sz w:val="19"/>
                 <w:szCs w:val="19"/>
               </w:rPr>
-              <w:t xml:space="preserve">PS specifically checks safe abstention</w:t>
+              <w:t xml:space="preserve">Rural centres have poor internet</w:t>
             </w:r>
           </w:p>
         </w:tc>
@@ -3154,7 +3175,7 @@
                 <w:sz w:val="19"/>
                 <w:szCs w:val="19"/>
               </w:rPr>
-              <w:t xml:space="preserve">Multilingual via Bhashini</w:t>
+              <w:t xml:space="preserve">Dashboard: flags centres whose grading looks suspicious</w:t>
             </w:r>
           </w:p>
         </w:tc>
@@ -3176,7 +3197,54 @@
                 <w:sz w:val="19"/>
                 <w:szCs w:val="19"/>
               </w:rPr>
-              <w:t xml:space="preserve">Reaches rural / non-English users</w:t>
+              <w:t xml:space="preserve">Solves ‘inconsistency across centres’ + anti-corruption</w:t>
+            </w:r>
+          </w:p>
+        </w:tc>
+      </w:tr>
+      <w:tr>
+        <w:tc>
+          <w:tcPr>
+            <w:tcW w:type="dxa" w:w="4513"/>
+            <w:shd w:fill="DCE6F1" w:color="auto" w:val="clear"/>
+            <w:tcMar>
+              <w:top w:type="dxa" w:w="60"/>
+              <w:left w:type="dxa" w:w="100"/>
+              <w:bottom w:type="dxa" w:w="60"/>
+              <w:right w:type="dxa" w:w="100"/>
+            </w:tcMar>
+          </w:tcPr>
+          <w:p>
+            <w:r>
+              <w:rPr>
+                <w:b/>
+                <w:bCs/>
+                <w:sz w:val="19"/>
+                <w:szCs w:val="19"/>
+              </w:rPr>
+              <w:t xml:space="preserve">Farmer gets report via SMS / WhatsApp / QR</w:t>
+            </w:r>
+          </w:p>
+        </w:tc>
+        <w:tc>
+          <w:tcPr>
+            <w:tcW w:type="dxa" w:w="4513"/>
+            <w:tcMar>
+              <w:top w:type="dxa" w:w="60"/>
+              <w:left w:type="dxa" w:w="100"/>
+              <w:bottom w:type="dxa" w:w="60"/>
+              <w:right w:type="dxa" w:w="100"/>
+            </w:tcMar>
+          </w:tcPr>
+          <w:p>
+            <w:r>
+              <w:rPr>
+                <w:b w:val="false"/>
+                <w:bCs w:val="false"/>
+                <w:sz w:val="19"/>
+                <w:szCs w:val="19"/>
+              </w:rPr>
+              <w:t xml:space="preserve">Fewer disputes, trust in govt procurement</w:t>
             </w:r>
           </w:p>
         </w:tc>
@@ -3198,7 +3266,22 @@
           <w:i/>
           <w:iCs/>
         </w:rPr>
-        <w:t xml:space="preserve">“An evidence-grounded AI co-pilot that turns complex Ayurvedic IP &amp; regulatory rules into a cited, jurisdiction-aware action plan.”</w:t>
+        <w:t xml:space="preserve">“Replace ‘the inspector says so’ with ‘the data shows so’ – a consistent, tamper-proof onion grade that farmers, officials and the ministry can all trust.”</w:t>
+      </w:r>
+    </w:p>
+    <w:p>
+      <w:pPr>
+        <w:spacing w:after="120"/>
+      </w:pPr>
+      <w:r>
+        <w:rPr>
+          <w:b/>
+          <w:bCs/>
+        </w:rPr>
+        <w:t xml:space="preserve">Key terms: </w:t>
+      </w:r>
+      <w:r>
+        <w:t xml:space="preserve">Grade A = meets procurement spec, full price. URS (Under Reference Specification) = below spec, bought at reduced price. Reject = not bought.</w:t>
       </w:r>
     </w:p>
     <w:p>
@@ -3213,7 +3296,7 @@
         <w:t xml:space="preserve">Careful: </w:t>
       </w:r>
       <w:r>
-        <w:t xml:space="preserve">don’t show fake confidence numbers (like 92%) as real – label them “sample” or base them on retrieval scores.</w:t>
+        <w:t xml:space="preserve">the app grades a SAMPLE spread on a tray, not a whole pile/bag – say this honestly; internal rot can’t be seen in a photo (mention as limitation).</w:t>
       </w:r>
     </w:p>
     <w:p>
@@ -3261,7 +3344,7 @@
                 <w:b/>
                 <w:bCs/>
               </w:rPr>
-              <w:t xml:space="preserve">We select SIH 26045 – IP-SAKTI Sahayak.</w:t>
+              <w:t xml:space="preserve">We select SIH 26031 – Onion Quality Grading App.</w:t>
             </w:r>
           </w:p>
           <w:p>
@@ -3274,7 +3357,7 @@
               <w:spacing w:after="60"/>
             </w:pPr>
             <w:r>
-              <w:t xml:space="preserve">Less competition than ISRO / agri PSs.</w:t>
+              <w:t xml:space="preserve">Lowest competition: 51 entries vs 88 for IP-SAKTI (as of 26 Sep 2026).</w:t>
             </w:r>
           </w:p>
           <w:p>
@@ -3287,7 +3370,7 @@
               <w:spacing w:after="60"/>
             </w:pPr>
             <w:r>
-              <w:t xml:space="preserve">Our plan already matches every requirement in the PS.</w:t>
+              <w:t xml:space="preserve">Very clear problem – easy to explain in a PPT with mockups.</w:t>
             </w:r>
           </w:p>
           <w:p>
@@ -3300,7 +3383,7 @@
               <w:spacing w:after="60"/>
             </w:pPr>
             <w:r>
-              <w:t xml:space="preserve">Strongest for a PPT-only submission.</w:t>
+              <w:t xml:space="preserve">No special legal/domain knowledge needed.</w:t>
             </w:r>
           </w:p>
           <w:p>
@@ -3313,7 +3396,20 @@
               <w:spacing w:after="60"/>
             </w:pPr>
             <w:r>
-              <w:t xml:space="preserve">Quickest to turn into a working prototype if we get selected.</w:t>
+              <w:t xml:space="preserve">Strong story: fairness to farmers, transparency, saving public money.</w:t>
+            </w:r>
+          </w:p>
+          <w:p>
+            <w:pPr>
+              <w:pStyle w:val="ListParagraph"/>
+              <w:numPr>
+                <w:ilvl w:val="0"/>
+                <w:numId w:val="2"/>
+              </w:numPr>
+              <w:spacing w:after="60"/>
+            </w:pPr>
+            <w:r>
+              <w:t xml:space="preserve">Simple demo if selected: photo → grade → PDF report with QR.</w:t>
             </w:r>
           </w:p>
           <w:p>
@@ -3328,7 +3424,7 @@
               <w:t xml:space="preserve">Backup: </w:t>
             </w:r>
             <w:r>
-              <w:t xml:space="preserve">SIH 26031 – Onion Grading (if 26045 turns out too crowded on the portal).</w:t>
+              <w:t xml:space="preserve">SIH 26045 – IP-SAKTI Sahayak (if Onion entries suddenly jump before the deadline).</w:t>
             </w:r>
           </w:p>
         </w:tc>
@@ -3479,7 +3575,7 @@
                 <w:sz w:val="19"/>
                 <w:szCs w:val="19"/>
               </w:rPr>
-              <w:t xml:space="preserve">Check number of submitted ideas for 26045 &amp; 26031 on SIH portal</w:t>
+              <w:t xml:space="preserve">Re-check entry counts (Onion vs IP-SAKTI) just before submitting</w:t>
             </w:r>
           </w:p>
         </w:tc>
@@ -3548,7 +3644,7 @@
                 <w:sz w:val="19"/>
                 <w:szCs w:val="19"/>
               </w:rPr>
-              <w:t xml:space="preserve">Study basics: Patents Act Sec 3(p), TKDL, Biological Diversity Act / ABS, Nagoya Protocol</w:t>
+              <w:t xml:space="preserve">Study basics: PSF buffer stock, NAFED/NCCF procurement, AGMARK onion grades, Grade A vs URS</w:t>
             </w:r>
           </w:p>
         </w:tc>
@@ -3617,7 +3713,7 @@
                 <w:sz w:val="19"/>
                 <w:szCs w:val="19"/>
               </w:rPr>
-              <w:t xml:space="preserve">Make Figma mockups: Classifier, Chat with sources, India/Intl switch, Roadmap, Dashboard</w:t>
+              <w:t xml:space="preserve">Make Figma mockups: Capture screen, Result screen, PDF report, Farmer QR page, Dashboard</w:t>
             </w:r>
           </w:p>
         </w:tc>
@@ -3686,7 +3782,7 @@
                 <w:sz w:val="19"/>
                 <w:szCs w:val="19"/>
               </w:rPr>
-              <w:t xml:space="preserve">Draw architecture + flow diagram</w:t>
+              <w:t xml:space="preserve">Draw architecture + flow diagram (photo → AI → grade → report → dashboard)</w:t>
             </w:r>
           </w:p>
         </w:tc>
@@ -3755,7 +3851,7 @@
                 <w:sz w:val="19"/>
                 <w:szCs w:val="19"/>
               </w:rPr>
-              <w:t xml:space="preserve">(Optional) Tiny RAG demo on 3–4 legal PDFs → take screenshot</w:t>
+              <w:t xml:space="preserve">(Optional) Run a pretrained onion/defect model on a few photos → take screenshot</w:t>
             </w:r>
           </w:p>
         </w:tc>
@@ -3777,7 +3873,7 @@
                 <w:sz w:val="19"/>
                 <w:szCs w:val="19"/>
               </w:rPr>
-              <w:t xml:space="preserve">AI/backend member</w:t>
+              <w:t xml:space="preserve">AI member</w:t>
             </w:r>
           </w:p>
         </w:tc>

</xml_diff>